<commit_message>
Rebuild submission documents so the supplement lists the package commit
Co-Authored-By: Claude Opus 5.5 <noreply@anthropic.com>
</commit_message>
<xml_diff>
--- a/submission/04_supplementary/Supplementary_Material.docx
+++ b/submission/04_supplementary/Supplementary_Material.docx
@@ -49271,7 +49271,7 @@
         <w:spacing w:after="0" w:before="0" w:line="276"/>
       </w:pPr>
       <w:r>
-        <w:t xml:space="preserve">The complete commit history of the repository (short hash, commit time in UTC−7, and message). Pre-registrations are </w:t>
+        <w:t xml:space="preserve">The commit history of the repository at the time this document was built (short hash, commit time in UTC−7, and message); later commits are in the public repository. Pre-registrations are </w:t>
       </w:r>
       <w:r>
         <w:rPr>
@@ -51246,7 +51246,7 @@
             <w:tcBorders>
               <w:top w:val="none" w:color="FFFFFF" w:sz="0"/>
               <w:left w:val="none" w:color="FFFFFF" w:sz="0"/>
-              <w:bottom w:val="single" w:color="000000" w:sz="6"/>
+              <w:bottom w:val="none" w:color="FFFFFF" w:sz="0"/>
               <w:right w:val="none" w:color="FFFFFF" w:sz="0"/>
             </w:tcBorders>
             <w:tcMar>
@@ -51276,6 +51276,72 @@
             <w:tcBorders>
               <w:top w:val="none" w:color="FFFFFF" w:sz="0"/>
               <w:left w:val="none" w:color="FFFFFF" w:sz="0"/>
+              <w:bottom w:val="none" w:color="FFFFFF" w:sz="0"/>
+              <w:right w:val="none" w:color="FFFFFF" w:sz="0"/>
+            </w:tcBorders>
+            <w:tcMar>
+              <w:top w:type="dxa" w:w="40"/>
+              <w:left w:type="dxa" w:w="80"/>
+              <w:bottom w:type="dxa" w:w="40"/>
+              <w:right w:type="dxa" w:w="80"/>
+            </w:tcMar>
+          </w:tcPr>
+          <w:p>
+            <w:pPr>
+              <w:spacing w:after="0" w:before="0" w:line="240"/>
+            </w:pPr>
+            <w:r>
+              <w:rPr>
+                <w:rFonts w:ascii="Times New Roman" w:cs="Times New Roman" w:eastAsia="Times New Roman" w:hAnsi="Times New Roman"/>
+                <w:sz w:val="16"/>
+                <w:szCs w:val="16"/>
+              </w:rPr>
+              <w:t xml:space="preserve">2026-09-23 12:20</w:t>
+            </w:r>
+          </w:p>
+        </w:tc>
+        <w:tc>
+          <w:tcPr>
+            <w:tcW w:type="dxa" w:w="2622"/>
+            <w:tcBorders>
+              <w:top w:val="none" w:color="FFFFFF" w:sz="0"/>
+              <w:left w:val="none" w:color="FFFFFF" w:sz="0"/>
+              <w:bottom w:val="none" w:color="FFFFFF" w:sz="0"/>
+              <w:right w:val="none" w:color="FFFFFF" w:sz="0"/>
+            </w:tcBorders>
+            <w:tcMar>
+              <w:top w:type="dxa" w:w="40"/>
+              <w:left w:type="dxa" w:w="80"/>
+              <w:bottom w:type="dxa" w:w="40"/>
+              <w:right w:type="dxa" w:w="80"/>
+            </w:tcMar>
+          </w:tcPr>
+          <w:p>
+            <w:pPr>
+              <w:spacing w:after="0" w:before="0" w:line="240"/>
+            </w:pPr>
+            <w:r>
+              <w:rPr>
+                <w:rFonts w:ascii="Times New Roman" w:cs="Times New Roman" w:eastAsia="Times New Roman" w:hAnsi="Times New Roman"/>
+                <w:sz w:val="16"/>
+                <w:szCs w:val="16"/>
+              </w:rPr>
+              <w:t xml:space="preserve">Docs: README and paper draft updated with sensitivity, Study 2b and Study 1b</w:t>
+            </w:r>
+          </w:p>
+        </w:tc>
+      </w:tr>
+      <w:tr>
+        <w:trPr>
+          <w:cantSplit/>
+          <w:tblHeader w:val="false"/>
+        </w:trPr>
+        <w:tc>
+          <w:tcPr>
+            <w:tcW w:type="dxa" w:w="2246"/>
+            <w:tcBorders>
+              <w:top w:val="none" w:color="FFFFFF" w:sz="0"/>
+              <w:left w:val="none" w:color="FFFFFF" w:sz="0"/>
               <w:bottom w:val="single" w:color="000000" w:sz="6"/>
               <w:right w:val="none" w:color="FFFFFF" w:sz="0"/>
             </w:tcBorders>
@@ -51292,11 +51358,41 @@
             </w:pPr>
             <w:r>
               <w:rPr>
-                <w:rFonts w:ascii="Times New Roman" w:cs="Times New Roman" w:eastAsia="Times New Roman" w:hAnsi="Times New Roman"/>
-                <w:sz w:val="16"/>
-                <w:szCs w:val="16"/>
-              </w:rPr>
-              <w:t xml:space="preserve">2026-09-23 12:20</w:t>
+                <w:rFonts w:ascii="Courier New" w:cs="Courier New" w:eastAsia="Courier New" w:hAnsi="Courier New"/>
+                <w:sz w:val="14"/>
+                <w:szCs w:val="14"/>
+              </w:rPr>
+              <w:t xml:space="preserve">8b7f8a2</w:t>
+            </w:r>
+          </w:p>
+        </w:tc>
+        <w:tc>
+          <w:tcPr>
+            <w:tcW w:type="dxa" w:w="4492"/>
+            <w:tcBorders>
+              <w:top w:val="none" w:color="FFFFFF" w:sz="0"/>
+              <w:left w:val="none" w:color="FFFFFF" w:sz="0"/>
+              <w:bottom w:val="single" w:color="000000" w:sz="6"/>
+              <w:right w:val="none" w:color="FFFFFF" w:sz="0"/>
+            </w:tcBorders>
+            <w:tcMar>
+              <w:top w:type="dxa" w:w="40"/>
+              <w:left w:type="dxa" w:w="80"/>
+              <w:bottom w:type="dxa" w:w="40"/>
+              <w:right w:type="dxa" w:w="80"/>
+            </w:tcMar>
+          </w:tcPr>
+          <w:p>
+            <w:pPr>
+              <w:spacing w:after="0" w:before="0" w:line="240"/>
+            </w:pPr>
+            <w:r>
+              <w:rPr>
+                <w:rFonts w:ascii="Times New Roman" w:cs="Times New Roman" w:eastAsia="Times New Roman" w:hAnsi="Times New Roman"/>
+                <w:sz w:val="16"/>
+                <w:szCs w:val="16"/>
+              </w:rPr>
+              <w:t xml:space="preserve">2026-09-23 13:18</w:t>
             </w:r>
           </w:p>
         </w:tc>
@@ -51326,7 +51422,7 @@
                 <w:sz w:val="16"/>
                 <w:szCs w:val="16"/>
               </w:rPr>
-              <w:t xml:space="preserve">Docs: README and paper draft updated with sensitivity, Study 2b and Study 1b</w:t>
+              <w:t xml:space="preserve">Submission package for Artificial Life: manuscript, figures, cover letter, supplement</w:t>
             </w:r>
           </w:p>
         </w:tc>

</xml_diff>